<commit_message>
Giorno tosto 🥨| 24.04.2026
</commit_message>
<xml_diff>
--- a/3_Documentazione/SamtAllStars.docx
+++ b/3_Documentazione/SamtAllStars.docx
@@ -10745,12 +10745,19 @@
         <w:rPr>
           <w:lang w:val="it-IT"/>
         </w:rPr>
-        <w:t>), dovranno apparire in questo capitolo</w:t>
-      </w:r>
+        <w:t xml:space="preserve">), dovranno apparire in questo </w:t>
+      </w:r>
+      <w:proofErr w:type="gramStart"/>
       <w:r>
         <w:rPr>
           <w:lang w:val="it-IT"/>
         </w:rPr>
+        <w:t>capitolo</w:t>
+      </w:r>
+      <w:r>
+        <w:rPr>
+          <w:lang w:val="it-IT"/>
+        </w:rPr>
         <w:t>.</w:t>
       </w:r>
       <w:r>
@@ -10759,6 +10766,7 @@
         </w:rPr>
         <w:t>.</w:t>
       </w:r>
+      <w:proofErr w:type="gramEnd"/>
     </w:p>
     <w:p>
       <w:pPr>
@@ -11341,7 +11349,21 @@
           <w:lang w:val="en-US"/>
         </w:rPr>
         <w:tab/>
-        <w:t>13th Gen Intel(R) Core(TM) i7-13700   2.10 GHz</w:t>
+        <w:t xml:space="preserve">13th Gen Intel(R) </w:t>
+      </w:r>
+      <w:proofErr w:type="gramStart"/>
+      <w:r>
+        <w:rPr>
+          <w:lang w:val="en-US"/>
+        </w:rPr>
+        <w:t>Core(</w:t>
+      </w:r>
+      <w:proofErr w:type="gramEnd"/>
+      <w:r>
+        <w:rPr>
+          <w:lang w:val="en-US"/>
+        </w:rPr>
+        <w:t>TM) i7-13700   2.10 GHz</w:t>
       </w:r>
     </w:p>
     <w:p>
@@ -13015,60 +13037,7 @@
       <w:bookmarkEnd w:id="10"/>
       <w:bookmarkEnd w:id="39"/>
     </w:p>
-    <w:p>
-      <w:r>
-        <w:t>In questo capitolo dovrà essere mostrato come è stato realizzato il lavoro. Questa parte può differenziarsi dalla progettazione in quanto il risultato ottenuto non per forza può essere come era stato progettato.</w:t>
-      </w:r>
-    </w:p>
-    <w:p>
-      <w:r>
-        <w:t xml:space="preserve">Sulla base di queste informazioni il lavoro svolto dovrà essere riproducibile. </w:t>
-      </w:r>
-    </w:p>
-    <w:p>
-      <w:r>
-        <w:t>In questa parte è richiesto l’inserimento di codice sorgente</w:t>
-      </w:r>
-      <w:r>
-        <w:t xml:space="preserve"> - </w:t>
-      </w:r>
-      <w:r>
-        <w:t>P</w:t>
-      </w:r>
-      <w:r>
-        <w:t xml:space="preserve">rint </w:t>
-      </w:r>
-      <w:r>
-        <w:t>S</w:t>
-      </w:r>
-      <w:r>
-        <w:t xml:space="preserve">creen </w:t>
-      </w:r>
-      <w:r>
-        <w:t xml:space="preserve">- </w:t>
-      </w:r>
-      <w:r>
-        <w:t>di maschere solamente per quei passaggi particolarmente significativi e/o critici.</w:t>
-      </w:r>
-    </w:p>
-    <w:p>
-      <w:r>
-        <w:t>Inoltre,</w:t>
-      </w:r>
-      <w:r>
-        <w:t xml:space="preserve"> dovranno essere descritte eventuali varianti di soluzione o scelte di prodotti con motivazione delle scelte.</w:t>
-      </w:r>
-    </w:p>
-    <w:p>
-      <w:r>
-        <w:t>Non deve apparire nessuna forma di guida d’uso di librerie o di componenti utilizzati. Eventualmente questa va allegata.</w:t>
-      </w:r>
-    </w:p>
-    <w:p>
-      <w:r>
-        <w:t>Per eventuali dettagli si possono inserire riferimenti ai diari.</w:t>
-      </w:r>
-    </w:p>
+    <w:p/>
     <w:p>
       <w:pPr>
         <w:pStyle w:val="Titolo1"/>

</xml_diff>

<commit_message>
Uso Git LFS per tracciare i file di build pesanti
</commit_message>
<xml_diff>
--- a/3_Documentazione/SamtAllStars.docx
+++ b/3_Documentazione/SamtAllStars.docx
@@ -3522,7 +3522,31 @@
         <w:rPr>
           <w:rFonts w:cstheme="minorHAnsi"/>
         </w:rPr>
-        <w:t>16.01.2026 - 9.06.2026</w:t>
+        <w:t xml:space="preserve">16.01.2026 </w:t>
+      </w:r>
+      <w:r>
+        <w:rPr>
+          <w:rFonts w:cstheme="minorHAnsi"/>
+        </w:rPr>
+        <w:t>–</w:t>
+      </w:r>
+      <w:r>
+        <w:rPr>
+          <w:rFonts w:cstheme="minorHAnsi"/>
+        </w:rPr>
+        <w:t xml:space="preserve"> </w:t>
+      </w:r>
+      <w:r>
+        <w:rPr>
+          <w:rFonts w:cstheme="minorHAnsi"/>
+        </w:rPr>
+        <w:t>29.05.</w:t>
+      </w:r>
+      <w:r>
+        <w:rPr>
+          <w:rFonts w:cstheme="minorHAnsi"/>
+        </w:rPr>
+        <w:t>2026</w:t>
       </w:r>
     </w:p>
     <w:p>
@@ -3736,23 +3760,7 @@
         <w:t>videogiochi di combattimento multiplayer locali</w:t>
       </w:r>
       <w:r>
-        <w:t xml:space="preserve">, in particolare dei </w:t>
-      </w:r>
-      <w:proofErr w:type="spellStart"/>
-      <w:r>
-        <w:t>fighting</w:t>
-      </w:r>
-      <w:proofErr w:type="spellEnd"/>
-      <w:r>
-        <w:t xml:space="preserve"> game in stile </w:t>
-      </w:r>
-      <w:proofErr w:type="spellStart"/>
-      <w:r>
-        <w:t>platform</w:t>
-      </w:r>
-      <w:proofErr w:type="spellEnd"/>
-      <w:r>
-        <w:t xml:space="preserve">, unendo meccaniche di combattimento rapide a un forte focus su abilità, strategia e varietà degli stili di gioco. </w:t>
+        <w:t xml:space="preserve">, in particolare dei fighting game in stile platform, unendo meccaniche di combattimento rapide a un forte focus su abilità, strategia e varietà degli stili di gioco. </w:t>
       </w:r>
     </w:p>
     <w:p>
@@ -3804,23 +3812,7 @@
         <w:t>usando</w:t>
       </w:r>
       <w:r>
-        <w:t xml:space="preserve"> una tastiera e tre controller (</w:t>
-      </w:r>
-      <w:proofErr w:type="spellStart"/>
-      <w:r>
-        <w:t>DualSense</w:t>
-      </w:r>
-      <w:proofErr w:type="spellEnd"/>
-      <w:r>
-        <w:t xml:space="preserve">, </w:t>
-      </w:r>
-      <w:proofErr w:type="spellStart"/>
-      <w:r>
-        <w:t>DualShock</w:t>
-      </w:r>
-      <w:proofErr w:type="spellEnd"/>
-      <w:r>
-        <w:t>)</w:t>
+        <w:t xml:space="preserve"> una tastiera e tre controller (DualSense, DualShock)</w:t>
       </w:r>
       <w:r>
         <w:t xml:space="preserve"> o quattro controller</w:t>
@@ -3839,15 +3831,7 @@
     </w:p>
     <w:p>
       <w:r>
-        <w:t xml:space="preserve">La situazione iniziale è quella di molti utenti che cercano un gioco di combattimento divertente e competitivo da giocare con amici sullo stesso dispositivo, senza dover affrontare configurazioni complesse o modalità online. Allo stesso tempo, esistono numerosi </w:t>
-      </w:r>
-      <w:proofErr w:type="spellStart"/>
-      <w:r>
-        <w:t>fighting</w:t>
-      </w:r>
-      <w:proofErr w:type="spellEnd"/>
-      <w:r>
-        <w:t xml:space="preserve"> game già affermati, come </w:t>
+        <w:t xml:space="preserve">La situazione iniziale è quella di molti utenti che cercano un gioco di combattimento divertente e competitivo da giocare con amici sullo stesso dispositivo, senza dover affrontare configurazioni complesse o modalità online. Allo stesso tempo, esistono numerosi fighting game già affermati, come </w:t>
       </w:r>
       <w:r>
         <w:rPr>
@@ -3869,7 +3853,6 @@
       <w:r>
         <w:t xml:space="preserve"> o </w:t>
       </w:r>
-      <w:proofErr w:type="spellStart"/>
       <w:r>
         <w:rPr>
           <w:i/>
@@ -3877,7 +3860,6 @@
         </w:rPr>
         <w:t>Fraymakers</w:t>
       </w:r>
-      <w:proofErr w:type="spellEnd"/>
       <w:r>
         <w:t>, che però presentano spesso personaggi con meccaniche simili tra loro e un’impostazione pensata per un pubblico molto ampio, riducendo la sensazione di unicità dei personaggi.</w:t>
       </w:r>
@@ -3937,15 +3919,7 @@
         <w:t>divertirsi o competere tra amici</w:t>
       </w:r>
       <w:r>
-        <w:t xml:space="preserve">, senza la necessità di possedere competenze tecniche o esperienze precedenti con i </w:t>
-      </w:r>
-      <w:proofErr w:type="spellStart"/>
-      <w:r>
-        <w:t>fighting</w:t>
-      </w:r>
-      <w:proofErr w:type="spellEnd"/>
-      <w:r>
-        <w:t xml:space="preserve"> game. Il prodotto è pensato per essere immediato: l’utente installa il gioco, </w:t>
+        <w:t xml:space="preserve">, senza la necessità di possedere competenze tecniche o esperienze precedenti con i fighting game. Il prodotto è pensato per essere immediato: l’utente installa il gioco, </w:t>
       </w:r>
       <w:r>
         <w:t xml:space="preserve">chiama un amico, </w:t>
@@ -9467,15 +9441,7 @@
               <w:jc w:val="both"/>
             </w:pPr>
             <w:r>
-              <w:t xml:space="preserve">Ci deve essere un </w:t>
-            </w:r>
-            <w:proofErr w:type="spellStart"/>
-            <w:r>
-              <w:t>compiler</w:t>
-            </w:r>
-            <w:proofErr w:type="spellEnd"/>
-            <w:r>
-              <w:t xml:space="preserve"> del gioco </w:t>
+              <w:t xml:space="preserve">Ci deve essere un compiler del gioco </w:t>
             </w:r>
           </w:p>
         </w:tc>
@@ -9592,39 +9558,8 @@
           <w:sz w:val="24"/>
           <w:szCs w:val="24"/>
         </w:rPr>
-        <w:t xml:space="preserve">US-01 — </w:t>
-      </w:r>
-      <w:proofErr w:type="spellStart"/>
-      <w:r>
-        <w:rPr>
-          <w:b/>
-          <w:bCs/>
-          <w:sz w:val="24"/>
-          <w:szCs w:val="24"/>
-        </w:rPr>
-        <w:t>Navigazione</w:t>
-      </w:r>
-      <w:proofErr w:type="spellEnd"/>
-      <w:r>
-        <w:rPr>
-          <w:b/>
-          <w:bCs/>
-          <w:sz w:val="24"/>
-          <w:szCs w:val="24"/>
-        </w:rPr>
-        <w:t xml:space="preserve"> dal menu </w:t>
-      </w:r>
-      <w:proofErr w:type="spellStart"/>
-      <w:r>
-        <w:rPr>
-          <w:b/>
-          <w:bCs/>
-          <w:sz w:val="24"/>
-          <w:szCs w:val="24"/>
-        </w:rPr>
-        <w:t>principale</w:t>
-      </w:r>
-      <w:proofErr w:type="spellEnd"/>
+        <w:t>US-01 — Navigazione dal menu principale</w:t>
+      </w:r>
     </w:p>
     <w:p>
       <w:r>
@@ -10287,15 +10222,7 @@
     </w:p>
     <w:p>
       <w:r>
-        <w:t xml:space="preserve">- Dato che i personaggi eseguono azioni previste, quando si attivano eventi specifici, allora vengono riprodotte anche le relative </w:t>
-      </w:r>
-      <w:proofErr w:type="spellStart"/>
-      <w:r>
-        <w:t>voiceline</w:t>
-      </w:r>
-      <w:proofErr w:type="spellEnd"/>
-      <w:r>
-        <w:t>.</w:t>
+        <w:t>- Dato che i personaggi eseguono azioni previste, quando si attivano eventi specifici, allora vengono riprodotte anche le relative voiceline.</w:t>
       </w:r>
     </w:p>
     <w:p/>
@@ -10731,42 +10658,20 @@
         <w:rPr>
           <w:lang w:val="it-IT"/>
         </w:rPr>
-        <w:t xml:space="preserve"> </w:t>
-      </w:r>
-      <w:proofErr w:type="spellStart"/>
+        <w:t xml:space="preserve"> scrum), dovranno apparire in questo capitolo</w:t>
+      </w:r>
       <w:r>
         <w:rPr>
           <w:lang w:val="it-IT"/>
         </w:rPr>
-        <w:t>scrum</w:t>
-      </w:r>
-      <w:proofErr w:type="spellEnd"/>
+        <w:t>.</w:t>
+      </w:r>
       <w:r>
         <w:rPr>
           <w:lang w:val="it-IT"/>
         </w:rPr>
-        <w:t xml:space="preserve">), dovranno apparire in questo </w:t>
-      </w:r>
-      <w:proofErr w:type="gramStart"/>
-      <w:r>
-        <w:rPr>
-          <w:lang w:val="it-IT"/>
-        </w:rPr>
-        <w:t>capitolo</w:t>
-      </w:r>
-      <w:r>
-        <w:rPr>
-          <w:lang w:val="it-IT"/>
-        </w:rPr>
         <w:t>.</w:t>
       </w:r>
-      <w:r>
-        <w:rPr>
-          <w:lang w:val="it-IT"/>
-        </w:rPr>
-        <w:t>.</w:t>
-      </w:r>
-      <w:proofErr w:type="gramEnd"/>
     </w:p>
     <w:p>
       <w:pPr>
@@ -10784,71 +10689,18 @@
     <w:p>
       <w:bookmarkStart w:id="15" w:name="_Toc413411419"/>
       <w:r>
-        <w:t xml:space="preserve">Durante la fase iniziale di analisi è emersa la necessità di valutare le diverse opzioni disponibili per lo sviluppo del progetto, in particolare riguardo all’utilizzo di un game </w:t>
-      </w:r>
-      <w:proofErr w:type="spellStart"/>
-      <w:r>
-        <w:t>engine</w:t>
-      </w:r>
-      <w:proofErr w:type="spellEnd"/>
-      <w:r>
-        <w:t xml:space="preserve"> e alla scelta del linguaggio di programmazione. Fin da subito è risultato evidente che sviluppare un videogioco di combattimento partendo “da zero”, senza l’uso di un </w:t>
-      </w:r>
-      <w:proofErr w:type="spellStart"/>
-      <w:r>
-        <w:t>engine</w:t>
-      </w:r>
-      <w:proofErr w:type="spellEnd"/>
-      <w:r>
-        <w:t>, avrebbe comportato una complessità eccessiva. La gestione manuale di rendering grafico, collisioni, fisica, input multipli e stato di gioco avrebbe richiesto tempi e competenze non compatibili con gli obiettivi e le tempistiche del progetto.</w:t>
+        <w:t>Durante la fase iniziale di analisi è emersa la necessità di valutare le diverse opzioni disponibili per lo sviluppo del progetto, in particolare riguardo all’utilizzo di un game engine e alla scelta del linguaggio di programmazione. Fin da subito è risultato evidente che sviluppare un videogioco di combattimento partendo “da zero”, senza l’uso di un engine, avrebbe comportato una complessità eccessiva. La gestione manuale di rendering grafico, collisioni, fisica, input multipli e stato di gioco avrebbe richiesto tempi e competenze non compatibili con gli obiettivi e le tempistiche del progetto.</w:t>
       </w:r>
     </w:p>
     <w:p/>
     <w:p>
       <w:r>
-        <w:t xml:space="preserve">Per questo motivo si è deciso di utilizzare un game </w:t>
-      </w:r>
-      <w:proofErr w:type="spellStart"/>
-      <w:r>
-        <w:t>engine</w:t>
-      </w:r>
-      <w:proofErr w:type="spellEnd"/>
-      <w:r>
-        <w:t xml:space="preserve">, che permettesse di concentrarsi maggiormente sulle meccaniche di gioco, sul bilanciamento dei personaggi e sull’esperienza utente, riducendo la complessità delle parti più tecniche e ripetitive. Tra le opzioni considerate vi erano diversi </w:t>
-      </w:r>
-      <w:proofErr w:type="spellStart"/>
-      <w:r>
-        <w:t>engine</w:t>
-      </w:r>
-      <w:proofErr w:type="spellEnd"/>
-      <w:r>
-        <w:t xml:space="preserve"> noti, come Unity, </w:t>
-      </w:r>
-      <w:proofErr w:type="spellStart"/>
-      <w:r>
-        <w:t>Unreal</w:t>
-      </w:r>
-      <w:proofErr w:type="spellEnd"/>
-      <w:r>
-        <w:t xml:space="preserve"> Engine e Godot.</w:t>
-      </w:r>
-    </w:p>
-    <w:p>
-      <w:proofErr w:type="spellStart"/>
-      <w:r>
-        <w:t>Unreal</w:t>
-      </w:r>
-      <w:proofErr w:type="spellEnd"/>
-      <w:r>
-        <w:t xml:space="preserve"> Engine è stato scartato principalmente a causa della sua complessità e del fatto che è pensato soprattutto per progetti 3D di grandi dimensioni. L’utilizzo del linguaggio </w:t>
-      </w:r>
-      <w:proofErr w:type="spellStart"/>
-      <w:r>
-        <w:t>Blueprint</w:t>
-      </w:r>
-      <w:proofErr w:type="spellEnd"/>
-      <w:r>
-        <w:t xml:space="preserve"> o di C++ avrebbe aumentato il carico di lavoro e la curva di apprendimento, risultando poco adatto a un progetto scolastico di dimensioni medio-piccole.</w:t>
+        <w:t>Per questo motivo si è deciso di utilizzare un game engine, che permettesse di concentrarsi maggiormente sulle meccaniche di gioco, sul bilanciamento dei personaggi e sull’esperienza utente, riducendo la complessità delle parti più tecniche e ripetitive. Tra le opzioni considerate vi erano diversi engine noti, come Unity, Unreal Engine e Godot.</w:t>
+      </w:r>
+    </w:p>
+    <w:p>
+      <w:r>
+        <w:t>Unreal Engine è stato scartato principalmente a causa della sua complessità e del fatto che è pensato soprattutto per progetti 3D di grandi dimensioni. L’utilizzo del linguaggio Blueprint o di C++ avrebbe aumentato il carico di lavoro e la curva di apprendimento, risultando poco adatto a un progetto scolastico di dimensioni medio-piccole.</w:t>
       </w:r>
     </w:p>
     <w:p/>
@@ -10857,23 +10709,7 @@
         <w:t xml:space="preserve">Godot rappresentava un’alternativa interessante per progetti 2D, grazie alla sua leggerezza e al fatto di essere open source. </w:t>
       </w:r>
       <w:r>
-        <w:t xml:space="preserve">Per questo motivo abbiamo fatto un confronto tra </w:t>
-      </w:r>
-      <w:proofErr w:type="spellStart"/>
-      <w:r>
-        <w:t>unity</w:t>
-      </w:r>
-      <w:proofErr w:type="spellEnd"/>
-      <w:r>
-        <w:t xml:space="preserve"> e </w:t>
-      </w:r>
-      <w:proofErr w:type="spellStart"/>
-      <w:r>
-        <w:t>godot</w:t>
-      </w:r>
-      <w:proofErr w:type="spellEnd"/>
-      <w:r>
-        <w:t xml:space="preserve"> per scegliere la variante ottimale (abbiamo pensato che non ha senso usare Godot con C# perché non è del tutto integrato bene):</w:t>
+        <w:t>Per questo motivo abbiamo fatto un confronto tra unity e godot per scegliere la variante ottimale (abbiamo pensato che non ha senso usare Godot con C# perché non è del tutto integrato bene):</w:t>
       </w:r>
     </w:p>
     <w:p/>
@@ -10976,11 +10812,9 @@
             <w:tcW w:w="3260" w:type="dxa"/>
           </w:tcPr>
           <w:p>
-            <w:proofErr w:type="spellStart"/>
             <w:r>
               <w:t>GDScript</w:t>
             </w:r>
-            <w:proofErr w:type="spellEnd"/>
           </w:p>
         </w:tc>
       </w:tr>
@@ -11087,13 +10921,8 @@
           </w:tcPr>
           <w:p>
             <w:r>
-              <w:t xml:space="preserve">Tutorial </w:t>
-            </w:r>
-            <w:proofErr w:type="spellStart"/>
-            <w:r>
-              <w:t>fighting</w:t>
-            </w:r>
-            <w:proofErr w:type="spellEnd"/>
+              <w:t>Tutorial fighting</w:t>
+            </w:r>
           </w:p>
         </w:tc>
         <w:tc>
@@ -11156,15 +10985,7 @@
         <w:t xml:space="preserve">Insomma </w:t>
       </w:r>
       <w:r>
-        <w:t xml:space="preserve">Unity è stato scelto perché riduce il tempo di sviluppo, non richiede apprendimento di nuovi linguaggi, gestisce nativamente più controller e offre strumenti migliori per bilanciamento e debug, elementi fondamentali per un </w:t>
-      </w:r>
-      <w:proofErr w:type="spellStart"/>
-      <w:r>
-        <w:t>fighting</w:t>
-      </w:r>
-      <w:proofErr w:type="spellEnd"/>
-      <w:r>
-        <w:t xml:space="preserve"> game multiplayer locale.</w:t>
+        <w:t>Unity è stato scelto perché riduce il tempo di sviluppo, non richiede apprendimento di nuovi linguaggi, gestisce nativamente più controller e offre strumenti migliori per bilanciamento e debug, elementi fondamentali per un fighting game multiplayer locale.</w:t>
       </w:r>
     </w:p>
     <w:p>
@@ -11198,11 +11019,9 @@
       </w:r>
     </w:p>
     <w:p>
-      <w:proofErr w:type="spellStart"/>
       <w:r>
         <w:t>Mockflow</w:t>
       </w:r>
-      <w:proofErr w:type="spellEnd"/>
     </w:p>
     <w:p>
       <w:r>
@@ -11223,13 +11042,8 @@
       </w:r>
     </w:p>
     <w:p>
-      <w:proofErr w:type="spellStart"/>
-      <w:r>
-        <w:t>Notepad</w:t>
-      </w:r>
-      <w:proofErr w:type="spellEnd"/>
-      <w:r>
-        <w:t xml:space="preserve">++ </w:t>
+      <w:r>
+        <w:t xml:space="preserve">Notepad++ </w:t>
       </w:r>
       <w:r>
         <w:t>8.8.9</w:t>
@@ -11241,11 +11055,9 @@
       </w:r>
     </w:p>
     <w:p>
-      <w:proofErr w:type="spellStart"/>
       <w:r>
         <w:t>SmackStudio</w:t>
       </w:r>
-      <w:proofErr w:type="spellEnd"/>
     </w:p>
     <w:p>
       <w:pPr>
@@ -11282,51 +11094,43 @@
         <w:rPr>
           <w:lang w:val="it-IT"/>
         </w:rPr>
-        <w:t xml:space="preserve">, gamepad </w:t>
-      </w:r>
-      <w:proofErr w:type="spellStart"/>
+        <w:t>, gamepad DualSense</w:t>
+      </w:r>
       <w:r>
         <w:rPr>
           <w:lang w:val="it-IT"/>
         </w:rPr>
-        <w:t>DualSense</w:t>
-      </w:r>
-      <w:proofErr w:type="spellEnd"/>
+        <w:t xml:space="preserve">, </w:t>
+      </w:r>
       <w:r>
         <w:rPr>
           <w:lang w:val="it-IT"/>
         </w:rPr>
-        <w:t xml:space="preserve">, </w:t>
+        <w:t xml:space="preserve">2 </w:t>
       </w:r>
       <w:r>
         <w:rPr>
           <w:lang w:val="it-IT"/>
         </w:rPr>
-        <w:t xml:space="preserve">2 </w:t>
+        <w:t>monitor, SSD</w:t>
       </w:r>
       <w:r>
         <w:rPr>
           <w:lang w:val="it-IT"/>
         </w:rPr>
-        <w:t>monitor, SSD</w:t>
-      </w:r>
-      <w:r>
+        <w:t>, 2 reti e cuffie.</w:t>
+      </w:r>
+    </w:p>
+    <w:p>
+      <w:pPr>
         <w:rPr>
           <w:lang w:val="it-IT"/>
         </w:rPr>
-        <w:t>, 2 reti e cuffie.</w:t>
-      </w:r>
-    </w:p>
-    <w:p>
-      <w:pPr>
+      </w:pPr>
+      <w:r>
         <w:rPr>
           <w:lang w:val="it-IT"/>
         </w:rPr>
-      </w:pPr>
-      <w:r>
-        <w:rPr>
-          <w:lang w:val="it-IT"/>
-        </w:rPr>
         <w:t>Caratteristiche pc:</w:t>
       </w:r>
     </w:p>
@@ -11336,34 +11140,18 @@
           <w:lang w:val="en-US"/>
         </w:rPr>
       </w:pPr>
-      <w:proofErr w:type="spellStart"/>
       <w:r>
         <w:rPr>
           <w:lang w:val="en-US"/>
         </w:rPr>
         <w:t>Processore</w:t>
       </w:r>
-      <w:proofErr w:type="spellEnd"/>
       <w:r>
         <w:rPr>
           <w:lang w:val="en-US"/>
         </w:rPr>
         <w:tab/>
-        <w:t xml:space="preserve">13th Gen Intel(R) </w:t>
-      </w:r>
-      <w:proofErr w:type="gramStart"/>
-      <w:r>
-        <w:rPr>
-          <w:lang w:val="en-US"/>
-        </w:rPr>
-        <w:t>Core(</w:t>
-      </w:r>
-      <w:proofErr w:type="gramEnd"/>
-      <w:r>
-        <w:rPr>
-          <w:lang w:val="en-US"/>
-        </w:rPr>
-        <w:t>TM) i7-13700   2.10 GHz</w:t>
+        <w:t>13th Gen Intel(R) Core(TM) i7-13700   2.10 GHz</w:t>
       </w:r>
     </w:p>
     <w:p>
@@ -11403,20 +11191,7 @@
           <w:lang w:val="it-IT"/>
         </w:rPr>
         <w:tab/>
-      </w:r>
-      <w:proofErr w:type="spellStart"/>
-      <w:r>
-        <w:rPr>
-          <w:lang w:val="it-IT"/>
-        </w:rPr>
-        <w:t>Sistema</w:t>
-      </w:r>
-      <w:proofErr w:type="spellEnd"/>
-      <w:r>
-        <w:rPr>
-          <w:lang w:val="it-IT"/>
-        </w:rPr>
-        <w:t xml:space="preserve"> operativo Windows 11 a 64 bit, processore basato su x64</w:t>
+        <w:t>Sistema operativo Windows 11 a 64 bit, processore basato su x64</w:t>
       </w:r>
     </w:p>
     <w:p>
@@ -11785,7 +11560,7 @@
           <w:lang w:val="it-IT"/>
         </w:rPr>
         <w:drawing>
-          <wp:inline distT="0" distB="0" distL="0" distR="0" wp14:anchorId="32C77638" wp14:editId="0274DF85">
+          <wp:inline distT="0" distB="0" distL="0" distR="0" wp14:anchorId="32C77638" wp14:editId="4424FC41">
             <wp:extent cx="5400000" cy="3599813"/>
             <wp:effectExtent l="38100" t="38100" r="29845" b="39370"/>
             <wp:docPr id="1958896181" name="Immagine 5"/>
@@ -12854,7 +12629,7 @@
               </wp:anchor>
             </w:drawing>
           </mc:Choice>
-          <mc:Fallback xmlns:w16sdtfl="http://schemas.microsoft.com/office/word/2024/wordml/sdtformatlock" xmlns:w16du="http://schemas.microsoft.com/office/word/2023/wordml/word16du">
+          <mc:Fallback xmlns:w16du="http://schemas.microsoft.com/office/word/2023/wordml/word16du" xmlns:w16sdtfl="http://schemas.microsoft.com/office/word/2024/wordml/sdtformatlock">
             <w:pict>
               <v:shapetype w14:anchorId="7B5D066C" id="_x0000_t202" coordsize="21600,21600" o:spt="202" path="m,l,21600r21600,l21600,xe">
                 <v:stroke joinstyle="miter"/>
@@ -15997,37 +15772,12 @@
                 <w:lang w:val="de-CH"/>
               </w:rPr>
             </w:pPr>
-            <w:proofErr w:type="spellStart"/>
             <w:r>
               <w:rPr>
                 <w:rFonts w:cs="Arial"/>
                 <w:lang w:val="de-CH"/>
               </w:rPr>
-              <w:t>Entrare</w:t>
-            </w:r>
-            <w:proofErr w:type="spellEnd"/>
-            <w:r>
-              <w:rPr>
-                <w:rFonts w:cs="Arial"/>
-                <w:lang w:val="de-CH"/>
-              </w:rPr>
-              <w:t xml:space="preserve"> </w:t>
-            </w:r>
-            <w:proofErr w:type="spellStart"/>
-            <w:r>
-              <w:rPr>
-                <w:rFonts w:cs="Arial"/>
-                <w:lang w:val="de-CH"/>
-              </w:rPr>
-              <w:t>dentro</w:t>
-            </w:r>
-            <w:proofErr w:type="spellEnd"/>
-            <w:r>
-              <w:rPr>
-                <w:rFonts w:cs="Arial"/>
-                <w:lang w:val="de-CH"/>
-              </w:rPr>
-              <w:t xml:space="preserve"> Samt-All-Stars</w:t>
+              <w:t>Entrare dentro Samt-All-Stars</w:t>
             </w:r>
           </w:p>
           <w:p>
@@ -16043,47 +15793,13 @@
                 <w:lang w:val="de-CH"/>
               </w:rPr>
             </w:pPr>
-            <w:proofErr w:type="spellStart"/>
             <w:r>
               <w:rPr>
                 <w:rFonts w:cs="Arial"/>
                 <w:lang w:val="de-CH"/>
               </w:rPr>
-              <w:t>Cliccare</w:t>
-            </w:r>
-            <w:proofErr w:type="spellEnd"/>
-            <w:r>
-              <w:rPr>
-                <w:rFonts w:cs="Arial"/>
-                <w:lang w:val="de-CH"/>
-              </w:rPr>
-              <w:t xml:space="preserve"> tasto </w:t>
-            </w:r>
-            <w:proofErr w:type="spellStart"/>
-            <w:r>
-              <w:rPr>
-                <w:rFonts w:cs="Arial"/>
-                <w:lang w:val="de-CH"/>
-              </w:rPr>
-              <w:t>avvio</w:t>
-            </w:r>
-            <w:proofErr w:type="spellEnd"/>
-            <w:r>
-              <w:rPr>
-                <w:rFonts w:cs="Arial"/>
-                <w:lang w:val="de-CH"/>
-              </w:rPr>
-              <w:t xml:space="preserve"> </w:t>
-            </w:r>
-            <w:proofErr w:type="spellStart"/>
-            <w:r>
-              <w:rPr>
-                <w:rFonts w:cs="Arial"/>
-                <w:lang w:val="de-CH"/>
-              </w:rPr>
-              <w:t>partita</w:t>
-            </w:r>
-            <w:proofErr w:type="spellEnd"/>
+              <w:t>Cliccare tasto avvio partita</w:t>
+            </w:r>
           </w:p>
           <w:p>
             <w:pPr>
@@ -16109,17 +15825,8 @@
                 <w:rFonts w:cs="Arial"/>
                 <w:lang w:val="de-CH"/>
               </w:rPr>
-              <w:t xml:space="preserve"> tasto </w:t>
-            </w:r>
-            <w:proofErr w:type="spellStart"/>
-            <w:r>
-              <w:rPr>
-                <w:rFonts w:cs="Arial"/>
-                <w:lang w:val="de-CH"/>
-              </w:rPr>
-              <w:t>impostazioni</w:t>
-            </w:r>
-            <w:proofErr w:type="spellEnd"/>
+              <w:t xml:space="preserve"> tasto impostazioni</w:t>
+            </w:r>
           </w:p>
           <w:p>
             <w:pPr>
@@ -16137,22 +15844,14 @@
               <w:rPr>
                 <w:rFonts w:cs="Arial"/>
               </w:rPr>
-              <w:t xml:space="preserve">Cliccare tasto lista die </w:t>
-            </w:r>
-            <w:proofErr w:type="spellStart"/>
+              <w:t>Cliccare tasto lista die p</w:t>
+            </w:r>
             <w:r>
               <w:rPr>
                 <w:rFonts w:cs="Arial"/>
               </w:rPr>
-              <w:t>p</w:t>
-            </w:r>
-            <w:r>
-              <w:rPr>
-                <w:rFonts w:cs="Arial"/>
-              </w:rPr>
               <w:t>ersnaggi</w:t>
             </w:r>
-            <w:proofErr w:type="spellEnd"/>
           </w:p>
           <w:p>
             <w:pPr>
@@ -16466,37 +16165,12 @@
                 <w:lang w:val="de-CH"/>
               </w:rPr>
             </w:pPr>
-            <w:proofErr w:type="spellStart"/>
             <w:r>
               <w:rPr>
                 <w:rFonts w:cs="Arial"/>
                 <w:lang w:val="de-CH"/>
               </w:rPr>
-              <w:t>Entrare</w:t>
-            </w:r>
-            <w:proofErr w:type="spellEnd"/>
-            <w:r>
-              <w:rPr>
-                <w:rFonts w:cs="Arial"/>
-                <w:lang w:val="de-CH"/>
-              </w:rPr>
-              <w:t xml:space="preserve"> </w:t>
-            </w:r>
-            <w:proofErr w:type="spellStart"/>
-            <w:r>
-              <w:rPr>
-                <w:rFonts w:cs="Arial"/>
-                <w:lang w:val="de-CH"/>
-              </w:rPr>
-              <w:t>dentro</w:t>
-            </w:r>
-            <w:proofErr w:type="spellEnd"/>
-            <w:r>
-              <w:rPr>
-                <w:rFonts w:cs="Arial"/>
-                <w:lang w:val="de-CH"/>
-              </w:rPr>
-              <w:t xml:space="preserve"> Samt-All-Stars</w:t>
+              <w:t>Entrare dentro Samt-All-Stars</w:t>
             </w:r>
           </w:p>
           <w:p>
@@ -16512,47 +16186,13 @@
                 <w:lang w:val="de-CH"/>
               </w:rPr>
             </w:pPr>
-            <w:proofErr w:type="spellStart"/>
             <w:r>
               <w:rPr>
                 <w:rFonts w:cs="Arial"/>
                 <w:lang w:val="de-CH"/>
               </w:rPr>
-              <w:t>Entrare</w:t>
-            </w:r>
-            <w:proofErr w:type="spellEnd"/>
-            <w:r>
-              <w:rPr>
-                <w:rFonts w:cs="Arial"/>
-                <w:lang w:val="de-CH"/>
-              </w:rPr>
-              <w:t xml:space="preserve"> </w:t>
-            </w:r>
-            <w:proofErr w:type="spellStart"/>
-            <w:r>
-              <w:rPr>
-                <w:rFonts w:cs="Arial"/>
-                <w:lang w:val="de-CH"/>
-              </w:rPr>
-              <w:t>dentro</w:t>
-            </w:r>
-            <w:proofErr w:type="spellEnd"/>
-            <w:r>
-              <w:rPr>
-                <w:rFonts w:cs="Arial"/>
-                <w:lang w:val="de-CH"/>
-              </w:rPr>
-              <w:t xml:space="preserve"> le </w:t>
-            </w:r>
-            <w:proofErr w:type="spellStart"/>
-            <w:r>
-              <w:rPr>
-                <w:rFonts w:cs="Arial"/>
-                <w:lang w:val="de-CH"/>
-              </w:rPr>
-              <w:t>impostazioni</w:t>
-            </w:r>
-            <w:proofErr w:type="spellEnd"/>
+              <w:t>Entrare dentro le impostazioni</w:t>
+            </w:r>
           </w:p>
           <w:p>
             <w:pPr>
@@ -16587,37 +16227,12 @@
                 <w:lang w:val="de-CH"/>
               </w:rPr>
             </w:pPr>
-            <w:proofErr w:type="spellStart"/>
             <w:r>
               <w:rPr>
                 <w:rFonts w:cs="Arial"/>
                 <w:lang w:val="de-CH"/>
               </w:rPr>
-              <w:t>Verificare</w:t>
-            </w:r>
-            <w:proofErr w:type="spellEnd"/>
-            <w:r>
-              <w:rPr>
-                <w:rFonts w:cs="Arial"/>
-                <w:lang w:val="de-CH"/>
-              </w:rPr>
-              <w:t xml:space="preserve"> il </w:t>
-            </w:r>
-            <w:proofErr w:type="spellStart"/>
-            <w:r>
-              <w:rPr>
-                <w:rFonts w:cs="Arial"/>
-                <w:lang w:val="de-CH"/>
-              </w:rPr>
-              <w:t>volume</w:t>
-            </w:r>
-            <w:proofErr w:type="spellEnd"/>
-            <w:r>
-              <w:rPr>
-                <w:rFonts w:cs="Arial"/>
-                <w:lang w:val="de-CH"/>
-              </w:rPr>
-              <w:t xml:space="preserve"> SFX</w:t>
+              <w:t>Verificare il volume SFX</w:t>
             </w:r>
           </w:p>
           <w:p>
@@ -16990,37 +16605,12 @@
                 <w:lang w:val="de-CH"/>
               </w:rPr>
             </w:pPr>
-            <w:proofErr w:type="spellStart"/>
             <w:r>
               <w:rPr>
                 <w:rFonts w:cs="Arial"/>
                 <w:lang w:val="de-CH"/>
               </w:rPr>
-              <w:t>Entrare</w:t>
-            </w:r>
-            <w:proofErr w:type="spellEnd"/>
-            <w:r>
-              <w:rPr>
-                <w:rFonts w:cs="Arial"/>
-                <w:lang w:val="de-CH"/>
-              </w:rPr>
-              <w:t xml:space="preserve"> </w:t>
-            </w:r>
-            <w:proofErr w:type="spellStart"/>
-            <w:r>
-              <w:rPr>
-                <w:rFonts w:cs="Arial"/>
-                <w:lang w:val="de-CH"/>
-              </w:rPr>
-              <w:t>dentro</w:t>
-            </w:r>
-            <w:proofErr w:type="spellEnd"/>
-            <w:r>
-              <w:rPr>
-                <w:rFonts w:cs="Arial"/>
-                <w:lang w:val="de-CH"/>
-              </w:rPr>
-              <w:t xml:space="preserve"> Samt-All-Stars</w:t>
+              <w:t>Entrare dentro Samt-All-Stars</w:t>
             </w:r>
           </w:p>
           <w:p>
@@ -17036,47 +16626,13 @@
                 <w:lang w:val="de-CH"/>
               </w:rPr>
             </w:pPr>
-            <w:proofErr w:type="spellStart"/>
             <w:r>
               <w:rPr>
                 <w:rFonts w:cs="Arial"/>
                 <w:lang w:val="de-CH"/>
               </w:rPr>
-              <w:t>Cliccare</w:t>
-            </w:r>
-            <w:proofErr w:type="spellEnd"/>
-            <w:r>
-              <w:rPr>
-                <w:rFonts w:cs="Arial"/>
-                <w:lang w:val="de-CH"/>
-              </w:rPr>
-              <w:t xml:space="preserve"> tasto </w:t>
-            </w:r>
-            <w:proofErr w:type="spellStart"/>
-            <w:r>
-              <w:rPr>
-                <w:rFonts w:cs="Arial"/>
-                <w:lang w:val="de-CH"/>
-              </w:rPr>
-              <w:t>avvio</w:t>
-            </w:r>
-            <w:proofErr w:type="spellEnd"/>
-            <w:r>
-              <w:rPr>
-                <w:rFonts w:cs="Arial"/>
-                <w:lang w:val="de-CH"/>
-              </w:rPr>
-              <w:t xml:space="preserve"> </w:t>
-            </w:r>
-            <w:proofErr w:type="spellStart"/>
-            <w:r>
-              <w:rPr>
-                <w:rFonts w:cs="Arial"/>
-                <w:lang w:val="de-CH"/>
-              </w:rPr>
-              <w:t>partita</w:t>
-            </w:r>
-            <w:proofErr w:type="spellEnd"/>
+              <w:t>Cliccare tasto avvio partita</w:t>
+            </w:r>
           </w:p>
           <w:p>
             <w:pPr>
@@ -17392,37 +16948,12 @@
                 <w:lang w:val="de-CH"/>
               </w:rPr>
             </w:pPr>
-            <w:proofErr w:type="spellStart"/>
             <w:r>
               <w:rPr>
                 <w:rFonts w:cs="Arial"/>
                 <w:lang w:val="de-CH"/>
               </w:rPr>
-              <w:t>Entrare</w:t>
-            </w:r>
-            <w:proofErr w:type="spellEnd"/>
-            <w:r>
-              <w:rPr>
-                <w:rFonts w:cs="Arial"/>
-                <w:lang w:val="de-CH"/>
-              </w:rPr>
-              <w:t xml:space="preserve"> </w:t>
-            </w:r>
-            <w:proofErr w:type="spellStart"/>
-            <w:r>
-              <w:rPr>
-                <w:rFonts w:cs="Arial"/>
-                <w:lang w:val="de-CH"/>
-              </w:rPr>
-              <w:t>dentro</w:t>
-            </w:r>
-            <w:proofErr w:type="spellEnd"/>
-            <w:r>
-              <w:rPr>
-                <w:rFonts w:cs="Arial"/>
-                <w:lang w:val="de-CH"/>
-              </w:rPr>
-              <w:t xml:space="preserve"> Samt-All-Stars</w:t>
+              <w:t>Entrare dentro Samt-All-Stars</w:t>
             </w:r>
           </w:p>
           <w:p>
@@ -17438,47 +16969,13 @@
                 <w:lang w:val="de-CH"/>
               </w:rPr>
             </w:pPr>
-            <w:proofErr w:type="spellStart"/>
             <w:r>
               <w:rPr>
                 <w:rFonts w:cs="Arial"/>
                 <w:lang w:val="de-CH"/>
               </w:rPr>
-              <w:t>Cliccare</w:t>
-            </w:r>
-            <w:proofErr w:type="spellEnd"/>
-            <w:r>
-              <w:rPr>
-                <w:rFonts w:cs="Arial"/>
-                <w:lang w:val="de-CH"/>
-              </w:rPr>
-              <w:t xml:space="preserve"> tasto </w:t>
-            </w:r>
-            <w:proofErr w:type="spellStart"/>
-            <w:r>
-              <w:rPr>
-                <w:rFonts w:cs="Arial"/>
-                <w:lang w:val="de-CH"/>
-              </w:rPr>
-              <w:t>avvio</w:t>
-            </w:r>
-            <w:proofErr w:type="spellEnd"/>
-            <w:r>
-              <w:rPr>
-                <w:rFonts w:cs="Arial"/>
-                <w:lang w:val="de-CH"/>
-              </w:rPr>
-              <w:t xml:space="preserve"> </w:t>
-            </w:r>
-            <w:proofErr w:type="spellStart"/>
-            <w:r>
-              <w:rPr>
-                <w:rFonts w:cs="Arial"/>
-                <w:lang w:val="de-CH"/>
-              </w:rPr>
-              <w:t>partita</w:t>
-            </w:r>
-            <w:proofErr w:type="spellEnd"/>
+              <w:t>Cliccare tasto avvio partita</w:t>
+            </w:r>
           </w:p>
           <w:p>
             <w:pPr>
@@ -17492,19 +16989,11 @@
                 <w:rFonts w:cs="Arial"/>
               </w:rPr>
             </w:pPr>
-            <w:proofErr w:type="spellStart"/>
             <w:r>
               <w:rPr>
                 <w:rFonts w:cs="Arial"/>
               </w:rPr>
-              <w:t>Scegiere</w:t>
-            </w:r>
-            <w:proofErr w:type="spellEnd"/>
-            <w:r>
-              <w:rPr>
-                <w:rFonts w:cs="Arial"/>
-              </w:rPr>
-              <w:t xml:space="preserve"> il personaggio</w:t>
+              <w:t>Scegiere il personaggio</w:t>
             </w:r>
           </w:p>
           <w:p>
@@ -17814,37 +17303,12 @@
                 <w:lang w:val="de-CH"/>
               </w:rPr>
             </w:pPr>
-            <w:proofErr w:type="spellStart"/>
             <w:r>
               <w:rPr>
                 <w:rFonts w:cs="Arial"/>
                 <w:lang w:val="de-CH"/>
               </w:rPr>
-              <w:t>Entrare</w:t>
-            </w:r>
-            <w:proofErr w:type="spellEnd"/>
-            <w:r>
-              <w:rPr>
-                <w:rFonts w:cs="Arial"/>
-                <w:lang w:val="de-CH"/>
-              </w:rPr>
-              <w:t xml:space="preserve"> </w:t>
-            </w:r>
-            <w:proofErr w:type="spellStart"/>
-            <w:r>
-              <w:rPr>
-                <w:rFonts w:cs="Arial"/>
-                <w:lang w:val="de-CH"/>
-              </w:rPr>
-              <w:t>dentro</w:t>
-            </w:r>
-            <w:proofErr w:type="spellEnd"/>
-            <w:r>
-              <w:rPr>
-                <w:rFonts w:cs="Arial"/>
-                <w:lang w:val="de-CH"/>
-              </w:rPr>
-              <w:t xml:space="preserve"> Samt-All-Stars</w:t>
+              <w:t>Entrare dentro Samt-All-Stars</w:t>
             </w:r>
           </w:p>
           <w:p>
@@ -17859,47 +17323,13 @@
                 <w:rFonts w:cs="Arial"/>
               </w:rPr>
             </w:pPr>
-            <w:proofErr w:type="spellStart"/>
             <w:r>
               <w:rPr>
                 <w:rFonts w:cs="Arial"/>
                 <w:lang w:val="de-CH"/>
               </w:rPr>
-              <w:t>Cliccare</w:t>
-            </w:r>
-            <w:proofErr w:type="spellEnd"/>
-            <w:r>
-              <w:rPr>
-                <w:rFonts w:cs="Arial"/>
-                <w:lang w:val="de-CH"/>
-              </w:rPr>
-              <w:t xml:space="preserve"> tasto </w:t>
-            </w:r>
-            <w:proofErr w:type="spellStart"/>
-            <w:r>
-              <w:rPr>
-                <w:rFonts w:cs="Arial"/>
-                <w:lang w:val="de-CH"/>
-              </w:rPr>
-              <w:t>avvio</w:t>
-            </w:r>
-            <w:proofErr w:type="spellEnd"/>
-            <w:r>
-              <w:rPr>
-                <w:rFonts w:cs="Arial"/>
-                <w:lang w:val="de-CH"/>
-              </w:rPr>
-              <w:t xml:space="preserve"> </w:t>
-            </w:r>
-            <w:proofErr w:type="spellStart"/>
-            <w:r>
-              <w:rPr>
-                <w:rFonts w:cs="Arial"/>
-                <w:lang w:val="de-CH"/>
-              </w:rPr>
-              <w:t>partita</w:t>
-            </w:r>
-            <w:proofErr w:type="spellEnd"/>
+              <w:t>Cliccare tasto avvio partita</w:t>
+            </w:r>
           </w:p>
           <w:p>
             <w:pPr>
@@ -18227,37 +17657,12 @@
                 <w:lang w:val="de-CH"/>
               </w:rPr>
             </w:pPr>
-            <w:proofErr w:type="spellStart"/>
             <w:r>
               <w:rPr>
                 <w:rFonts w:cs="Arial"/>
                 <w:lang w:val="de-CH"/>
               </w:rPr>
-              <w:t>Entrare</w:t>
-            </w:r>
-            <w:proofErr w:type="spellEnd"/>
-            <w:r>
-              <w:rPr>
-                <w:rFonts w:cs="Arial"/>
-                <w:lang w:val="de-CH"/>
-              </w:rPr>
-              <w:t xml:space="preserve"> </w:t>
-            </w:r>
-            <w:proofErr w:type="spellStart"/>
-            <w:r>
-              <w:rPr>
-                <w:rFonts w:cs="Arial"/>
-                <w:lang w:val="de-CH"/>
-              </w:rPr>
-              <w:t>dentro</w:t>
-            </w:r>
-            <w:proofErr w:type="spellEnd"/>
-            <w:r>
-              <w:rPr>
-                <w:rFonts w:cs="Arial"/>
-                <w:lang w:val="de-CH"/>
-              </w:rPr>
-              <w:t xml:space="preserve"> Samt-All-Stars</w:t>
+              <w:t>Entrare dentro Samt-All-Stars</w:t>
             </w:r>
           </w:p>
           <w:p>
@@ -18272,47 +17677,13 @@
                 <w:rFonts w:cs="Arial"/>
               </w:rPr>
             </w:pPr>
-            <w:proofErr w:type="spellStart"/>
             <w:r>
               <w:rPr>
                 <w:rFonts w:cs="Arial"/>
                 <w:lang w:val="de-CH"/>
               </w:rPr>
-              <w:t>Cliccare</w:t>
-            </w:r>
-            <w:proofErr w:type="spellEnd"/>
-            <w:r>
-              <w:rPr>
-                <w:rFonts w:cs="Arial"/>
-                <w:lang w:val="de-CH"/>
-              </w:rPr>
-              <w:t xml:space="preserve"> tasto </w:t>
-            </w:r>
-            <w:proofErr w:type="spellStart"/>
-            <w:r>
-              <w:rPr>
-                <w:rFonts w:cs="Arial"/>
-                <w:lang w:val="de-CH"/>
-              </w:rPr>
-              <w:t>avvio</w:t>
-            </w:r>
-            <w:proofErr w:type="spellEnd"/>
-            <w:r>
-              <w:rPr>
-                <w:rFonts w:cs="Arial"/>
-                <w:lang w:val="de-CH"/>
-              </w:rPr>
-              <w:t xml:space="preserve"> </w:t>
-            </w:r>
-            <w:proofErr w:type="spellStart"/>
-            <w:r>
-              <w:rPr>
-                <w:rFonts w:cs="Arial"/>
-                <w:lang w:val="de-CH"/>
-              </w:rPr>
-              <w:t>partita</w:t>
-            </w:r>
-            <w:proofErr w:type="spellEnd"/>
+              <w:t>Cliccare tasto avvio partita</w:t>
+            </w:r>
           </w:p>
           <w:p>
             <w:pPr>
@@ -18662,37 +18033,12 @@
                 <w:lang w:val="de-CH"/>
               </w:rPr>
             </w:pPr>
-            <w:proofErr w:type="spellStart"/>
             <w:r>
               <w:rPr>
                 <w:rFonts w:cs="Arial"/>
                 <w:lang w:val="de-CH"/>
               </w:rPr>
-              <w:t>Entrare</w:t>
-            </w:r>
-            <w:proofErr w:type="spellEnd"/>
-            <w:r>
-              <w:rPr>
-                <w:rFonts w:cs="Arial"/>
-                <w:lang w:val="de-CH"/>
-              </w:rPr>
-              <w:t xml:space="preserve"> </w:t>
-            </w:r>
-            <w:proofErr w:type="spellStart"/>
-            <w:r>
-              <w:rPr>
-                <w:rFonts w:cs="Arial"/>
-                <w:lang w:val="de-CH"/>
-              </w:rPr>
-              <w:t>dentro</w:t>
-            </w:r>
-            <w:proofErr w:type="spellEnd"/>
-            <w:r>
-              <w:rPr>
-                <w:rFonts w:cs="Arial"/>
-                <w:lang w:val="de-CH"/>
-              </w:rPr>
-              <w:t xml:space="preserve"> Samt-All-Stars</w:t>
+              <w:t>Entrare dentro Samt-All-Stars</w:t>
             </w:r>
           </w:p>
           <w:p>
@@ -18708,63 +18054,13 @@
                 <w:lang w:val="de-CH"/>
               </w:rPr>
             </w:pPr>
-            <w:proofErr w:type="spellStart"/>
             <w:r>
               <w:rPr>
                 <w:rFonts w:cs="Arial"/>
                 <w:lang w:val="de-CH"/>
               </w:rPr>
-              <w:t>Giocare</w:t>
-            </w:r>
-            <w:proofErr w:type="spellEnd"/>
-            <w:r>
-              <w:rPr>
-                <w:rFonts w:cs="Arial"/>
-                <w:lang w:val="de-CH"/>
-              </w:rPr>
-              <w:t xml:space="preserve"> </w:t>
-            </w:r>
-            <w:proofErr w:type="spellStart"/>
-            <w:r>
-              <w:rPr>
-                <w:rFonts w:cs="Arial"/>
-                <w:lang w:val="de-CH"/>
-              </w:rPr>
-              <w:t>un</w:t>
-            </w:r>
-            <w:proofErr w:type="spellEnd"/>
-            <w:r>
-              <w:rPr>
-                <w:rFonts w:cs="Arial"/>
-                <w:lang w:val="de-CH"/>
-              </w:rPr>
-              <w:t xml:space="preserve"> </w:t>
-            </w:r>
-            <w:proofErr w:type="spellStart"/>
-            <w:r>
-              <w:rPr>
-                <w:rFonts w:cs="Arial"/>
-                <w:lang w:val="de-CH"/>
-              </w:rPr>
-              <w:t>paio</w:t>
-            </w:r>
-            <w:proofErr w:type="spellEnd"/>
-            <w:r>
-              <w:rPr>
-                <w:rFonts w:cs="Arial"/>
-                <w:lang w:val="de-CH"/>
-              </w:rPr>
-              <w:t xml:space="preserve"> di </w:t>
-            </w:r>
-            <w:proofErr w:type="spellStart"/>
-            <w:r>
-              <w:rPr>
-                <w:rFonts w:cs="Arial"/>
-                <w:lang w:val="de-CH"/>
-              </w:rPr>
-              <w:t>partite</w:t>
-            </w:r>
-            <w:proofErr w:type="spellEnd"/>
+              <w:t>Giocare un paio di partite</w:t>
+            </w:r>
           </w:p>
           <w:p>
             <w:pPr>
@@ -19079,37 +18375,12 @@
                 <w:lang w:val="de-CH"/>
               </w:rPr>
             </w:pPr>
-            <w:proofErr w:type="spellStart"/>
             <w:r>
               <w:rPr>
                 <w:rFonts w:cs="Arial"/>
                 <w:lang w:val="de-CH"/>
               </w:rPr>
-              <w:t>Entrare</w:t>
-            </w:r>
-            <w:proofErr w:type="spellEnd"/>
-            <w:r>
-              <w:rPr>
-                <w:rFonts w:cs="Arial"/>
-                <w:lang w:val="de-CH"/>
-              </w:rPr>
-              <w:t xml:space="preserve"> </w:t>
-            </w:r>
-            <w:proofErr w:type="spellStart"/>
-            <w:r>
-              <w:rPr>
-                <w:rFonts w:cs="Arial"/>
-                <w:lang w:val="de-CH"/>
-              </w:rPr>
-              <w:t>dentro</w:t>
-            </w:r>
-            <w:proofErr w:type="spellEnd"/>
-            <w:r>
-              <w:rPr>
-                <w:rFonts w:cs="Arial"/>
-                <w:lang w:val="de-CH"/>
-              </w:rPr>
-              <w:t xml:space="preserve"> Samt-All-Stars</w:t>
+              <w:t>Entrare dentro Samt-All-Stars</w:t>
             </w:r>
           </w:p>
           <w:p>
@@ -19125,31 +18396,13 @@
                 <w:lang w:val="de-CH"/>
               </w:rPr>
             </w:pPr>
-            <w:proofErr w:type="spellStart"/>
             <w:r>
               <w:rPr>
                 <w:rFonts w:cs="Arial"/>
                 <w:lang w:val="de-CH"/>
               </w:rPr>
-              <w:t>Provare</w:t>
-            </w:r>
-            <w:proofErr w:type="spellEnd"/>
-            <w:r>
-              <w:rPr>
-                <w:rFonts w:cs="Arial"/>
-                <w:lang w:val="de-CH"/>
-              </w:rPr>
-              <w:t xml:space="preserve"> le diverse </w:t>
-            </w:r>
-            <w:proofErr w:type="spellStart"/>
-            <w:r>
-              <w:rPr>
-                <w:rFonts w:cs="Arial"/>
-                <w:lang w:val="de-CH"/>
-              </w:rPr>
-              <w:t>funzionalità</w:t>
-            </w:r>
-            <w:proofErr w:type="spellEnd"/>
+              <w:t>Provare le diverse funzionalità</w:t>
+            </w:r>
           </w:p>
         </w:tc>
       </w:tr>
@@ -19582,15 +18835,7 @@
               </w:rPr>
             </w:pPr>
             <w:r>
-              <w:t>Risorsa digitale importata nel progetto: immagini (</w:t>
-            </w:r>
-            <w:proofErr w:type="spellStart"/>
-            <w:r>
-              <w:t>sprite</w:t>
-            </w:r>
-            <w:proofErr w:type="spellEnd"/>
-            <w:r>
-              <w:t>), file audio, animazioni, prefabbricati.</w:t>
+              <w:t>Risorsa digitale importata nel progetto: immagini (sprite), file audio, animazioni, prefabbricati.</w:t>
             </w:r>
           </w:p>
         </w:tc>
@@ -19640,15 +18885,7 @@
               <w:jc w:val="both"/>
             </w:pPr>
             <w:r>
-              <w:t xml:space="preserve">Periferica fisica di input (es. </w:t>
-            </w:r>
-            <w:proofErr w:type="spellStart"/>
-            <w:r>
-              <w:t>DualSense</w:t>
-            </w:r>
-            <w:proofErr w:type="spellEnd"/>
-            <w:r>
-              <w:t>, Xbox pad). Nel progetto, distinta dalla tastiera.</w:t>
+              <w:t>Periferica fisica di input (es. DualSense, Xbox pad). Nel progetto, distinta dalla tastiera.</w:t>
             </w:r>
           </w:p>
         </w:tc>
@@ -19659,11 +18896,9 @@
             <w:tcW w:w="4814" w:type="dxa"/>
           </w:tcPr>
           <w:p>
-            <w:proofErr w:type="spellStart"/>
             <w:r>
               <w:t>Hitbox</w:t>
             </w:r>
-            <w:proofErr w:type="spellEnd"/>
           </w:p>
         </w:tc>
         <w:tc>
@@ -19736,11 +18971,9 @@
             <w:tcW w:w="4814" w:type="dxa"/>
           </w:tcPr>
           <w:p>
-            <w:proofErr w:type="spellStart"/>
             <w:r>
               <w:t>Voiceline</w:t>
             </w:r>
-            <w:proofErr w:type="spellEnd"/>
           </w:p>
         </w:tc>
         <w:tc>
@@ -19822,21 +19055,7 @@
         <w:rPr>
           <w:lang w:val="it-IT"/>
         </w:rPr>
-        <w:t xml:space="preserve"> (se troppo lungo solo dominio, </w:t>
-      </w:r>
-      <w:proofErr w:type="spellStart"/>
-      <w:r>
-        <w:rPr>
-          <w:lang w:val="it-IT"/>
-        </w:rPr>
-        <w:t>evt</w:t>
-      </w:r>
-      <w:proofErr w:type="spellEnd"/>
-      <w:r>
-        <w:rPr>
-          <w:lang w:val="it-IT"/>
-        </w:rPr>
-        <w:t xml:space="preserve"> completo nel diario)</w:t>
+        <w:t xml:space="preserve"> (se troppo lungo solo dominio, evt completo nel diario)</w:t>
       </w:r>
       <w:r>
         <w:rPr>
@@ -20099,22 +19318,14 @@
         <w:rPr>
           <w:lang w:val="it-IT"/>
         </w:rPr>
-        <w:t xml:space="preserve">Mandato e/o </w:t>
-      </w:r>
-      <w:proofErr w:type="spellStart"/>
+        <w:t>Mandato e/o Qd</w:t>
+      </w:r>
       <w:r>
         <w:rPr>
           <w:lang w:val="it-IT"/>
         </w:rPr>
-        <w:t>Qd</w:t>
-      </w:r>
-      <w:r>
-        <w:rPr>
-          <w:lang w:val="it-IT"/>
-        </w:rPr>
         <w:t>C</w:t>
       </w:r>
-      <w:proofErr w:type="spellEnd"/>
     </w:p>
     <w:p>
       <w:pPr>
@@ -20251,7 +19462,7 @@
       <w:rPr>
         <w:noProof/>
       </w:rPr>
-      <w:t>19.03.2026</w:t>
+      <w:t>24.04.2026</w:t>
     </w:r>
     <w:r>
       <w:fldChar w:fldCharType="end"/>
@@ -20346,21 +19557,7 @@
             <w:rPr>
               <w:lang w:val="fr-CH"/>
             </w:rPr>
-            <w:t xml:space="preserve">Sidon Samuel, Quan </w:t>
-          </w:r>
-          <w:proofErr w:type="spellStart"/>
-          <w:r>
-            <w:rPr>
-              <w:lang w:val="fr-CH"/>
-            </w:rPr>
-            <w:t>Tran</w:t>
-          </w:r>
-          <w:proofErr w:type="spellEnd"/>
-          <w:r>
-            <w:rPr>
-              <w:lang w:val="fr-CH"/>
-            </w:rPr>
-            <w:t>, Y</w:t>
+            <w:t>Sidon Samuel, Quan Tran, Y</w:t>
           </w:r>
           <w:r>
             <w:rPr>
@@ -20638,7 +19835,7 @@
       <w:rPr>
         <w:noProof/>
       </w:rPr>
-      <w:t>19.03.2026</w:t>
+      <w:t>24.04.2026</w:t>
     </w:r>
     <w:r>
       <w:fldChar w:fldCharType="end"/>
@@ -20703,7 +19900,7 @@
       <w:rPr>
         <w:noProof/>
       </w:rPr>
-      <w:t>19.03.2026</w:t>
+      <w:t>24.04.2026</w:t>
     </w:r>
     <w:r>
       <w:fldChar w:fldCharType="end"/>

</xml_diff>